<commit_message>
Update base resume after manual review
</commit_message>
<xml_diff>
--- a/base_resume.docx
+++ b/base_resume.docx
@@ -57,12 +57,61 @@
     </w:p>
     <w:p>
       <w:r>
-        <w:t>Independent Software Developer | Auto-Recruiter Responder Bot | Jan 2026 - Present</w:t>
+        <w:t xml:space="preserve">Founder &amp; Owner, </w:t>
+      </w:r>
+      <w:proofErr w:type="spellStart"/>
+      <w:r>
+        <w:t>MicroComp</w:t>
+      </w:r>
+      <w:proofErr w:type="spellEnd"/>
+      <w:r>
+        <w:t xml:space="preserve"> IT Solutions | </w:t>
+      </w:r>
+      <w:hyperlink r:id="rId6" w:history="1">
+        <w:r>
+          <w:rPr>
+            <w:rStyle w:val="Hyperlink"/>
+          </w:rPr>
+          <w:t>www.microcompit.com</w:t>
+        </w:r>
+      </w:hyperlink>
+      <w:r>
+        <w:t xml:space="preserve"> for software architecture and design development services</w:t>
       </w:r>
     </w:p>
     <w:p>
       <w:r>
-        <w:t>*   Developed a Python application integrating Google Gemini 2.5 API to autonomously triage incoming recruiter emails and generate dynamically tailored docx resumes based on job requirements.</w:t>
+        <w:t>*   Designed and maintained the microcompit.com IT-solutions website, including lead handling, analytics, and deployment workflows.</w:t>
+      </w:r>
+    </w:p>
+    <w:p>
+      <w:r>
+        <w:t xml:space="preserve">*   </w:t>
+      </w:r>
+      <w:r>
+        <w:t xml:space="preserve">Integrated AI Chatbot into the </w:t>
+      </w:r>
+      <w:hyperlink r:id="rId7" w:history="1">
+        <w:r>
+          <w:rPr>
+            <w:rStyle w:val="Hyperlink"/>
+          </w:rPr>
+          <w:t>www.microcompit.com</w:t>
+        </w:r>
+      </w:hyperlink>
+      <w:r>
+        <w:t xml:space="preserve"> website, to drive lead generation</w:t>
+      </w:r>
+    </w:p>
+    <w:p>
+      <w:r>
+        <w:t xml:space="preserve">*   </w:t>
+      </w:r>
+      <w:r>
+        <w:t xml:space="preserve">Developed a Python application integrating Google Gemini 2.5 API to autonomously triage incoming </w:t>
+      </w:r>
+      <w:r>
+        <w:t>leads</w:t>
       </w:r>
     </w:p>
     <w:p>
@@ -77,7 +126,19 @@
     </w:p>
     <w:p>
       <w:r>
-        <w:t>Wells Fargo | Jan 2013 - March 24, 2026</w:t>
+        <w:t xml:space="preserve">Wells Fargo | Jan 2013 - </w:t>
+      </w:r>
+      <w:r>
+        <w:t>June</w:t>
+      </w:r>
+      <w:r>
+        <w:t xml:space="preserve"> </w:t>
+      </w:r>
+      <w:r>
+        <w:t>06</w:t>
+      </w:r>
+      <w:r>
+        <w:t>, 2026</w:t>
       </w:r>
     </w:p>
     <w:p>
@@ -97,6 +158,7 @@
     </w:p>
     <w:p>
       <w:r>
+        <w:lastRenderedPageBreak/>
         <w:t>*   SDLC CI/CD Development Operations setup processes.</w:t>
       </w:r>
     </w:p>
@@ -112,7 +174,6 @@
     </w:p>
     <w:p>
       <w:r>
-        <w:lastRenderedPageBreak/>
         <w:t>*   Engaged directors and executive leadership for project configuration of processes and execution flows in Jira, and Jira administration.</w:t>
       </w:r>
     </w:p>
@@ -208,6 +269,7 @@
     </w:p>
     <w:p>
       <w:r>
+        <w:lastRenderedPageBreak/>
         <w:t>Software Consultant | Scottsdale AZ</w:t>
       </w:r>
     </w:p>
@@ -218,7 +280,6 @@
     </w:p>
     <w:p>
       <w:r>
-        <w:lastRenderedPageBreak/>
         <w:t>*   Developed software for Cryptographic Interface Layer (CIL) software project using ARMv7, Advanced Infosec Machine ASIC.</w:t>
       </w:r>
     </w:p>
@@ -329,6 +390,7 @@
     </w:p>
     <w:p>
       <w:r>
+        <w:lastRenderedPageBreak/>
         <w:t>*   Real-time embedded software for UMTS Base Station Cellular Transceiver.</w:t>
       </w:r>
     </w:p>
@@ -344,7 +406,6 @@
     </w:p>
     <w:p>
       <w:r>
-        <w:lastRenderedPageBreak/>
         <w:t>Software Engineer | Saint Petersburg, FL</w:t>
       </w:r>
     </w:p>
@@ -12021,6 +12082,29 @@
       </w:tcPr>
     </w:tblStylePr>
   </w:style>
+  <w:style w:type="character" w:styleId="Hyperlink">
+    <w:name w:val="Hyperlink"/>
+    <w:basedOn w:val="DefaultParagraphFont"/>
+    <w:uiPriority w:val="99"/>
+    <w:unhideWhenUsed/>
+    <w:rsid w:val="00D47F24"/>
+    <w:rPr>
+      <w:color w:val="0000FF" w:themeColor="hyperlink"/>
+      <w:u w:val="single"/>
+    </w:rPr>
+  </w:style>
+  <w:style w:type="character" w:styleId="UnresolvedMention">
+    <w:name w:val="Unresolved Mention"/>
+    <w:basedOn w:val="DefaultParagraphFont"/>
+    <w:uiPriority w:val="99"/>
+    <w:semiHidden/>
+    <w:unhideWhenUsed/>
+    <w:rsid w:val="00D47F24"/>
+    <w:rPr>
+      <w:color w:val="605E5C"/>
+      <w:shd w:val="clear" w:color="auto" w:fill="E1DFDD"/>
+    </w:rPr>
+  </w:style>
 </w:styles>
 </file>
 

</xml_diff>